<commit_message>
Add final introduction/conclusion, indexes and appendices; move book closing out of ch14
- Introduction revised for the final 14-chapter structure; conclusion rewritten
  and merged with the book closing formerly at the end of chapter 14
- Indexes generated from the final chapters: contents, verses, hadiths/athar,
  unified references
- Appendices corrected: 13 pillars, shifted glossary fields, no criteria scoring
  of decisions, authority concepts under 11.6, untested-tool disclaimers
- Chapter 14: fix opening verse reference (al-Mulk:2)

Co-Authored-By: Claude Opus 5.5 <noreply@anthropic.com>
Claude-Session: https://claude.ai/code/session_01LhGpaEd3xGUonrLS6HmYox
</commit_message>
<xml_diff>
--- a/chapters/الفصل_الرابع_عشر_النهائي.docx
+++ b/chapters/الفصل_الرابع_عشر_النهائي.docx
@@ -130,7 +130,7 @@
           <w:szCs w:val="28"/>
           <w:rtl/>
         </w:rPr>
-        <w:t>طه : 114</w:t>
+        <w:t xml:space="preserve">الملك : 2</w:t>
       </w:r>
     </w:p>
     <w:p>
@@ -1676,7 +1676,7 @@
                 <w:szCs w:val="26"/>
                 <w:rtl/>
               </w:rPr>
-              <w:t xml:space="preserve">ما أنجزه الكتاب وما لم ينجزه، ويحدد أولويات البحث الميداني القادم.</w:t>
+              <w:t xml:space="preserve">حدود ما تبيّنه الحالات وما لا تثبته، ويحدد أولويات البحث الميداني القادم.</w:t>
             </w:r>
           </w:p>
         </w:tc>
@@ -24310,919 +24310,6 @@
         </w:tc>
       </w:tr>
     </w:tbl>
-    <w:p>
-      <w:pPr>
-        <w:bidi/>
-        <w:spacing w:after="55"/>
-        <w:jc w:val="center"/>
-        <w:rPr>
-          <w:rFonts w:ascii="Sakkal Majalla" w:hAnsi="Sakkal Majalla" w:cs="Sakkal Majalla"/>
-          <w:sz w:val="28"/>
-          <w:szCs w:val="28"/>
-        </w:rPr>
-      </w:pPr>
-    </w:p>
-    <w:p>
-      <w:pPr>
-        <w:shd w:val="clear" w:color="auto" w:fill="156082"/>
-        <w:bidi/>
-        <w:spacing w:before="140" w:after="85"/>
-        <w:rPr>
-          <w:rFonts w:ascii="Sakkal Majalla" w:hAnsi="Sakkal Majalla" w:cs="Sakkal Majalla"/>
-          <w:sz w:val="26"/>
-          <w:szCs w:val="26"/>
-        </w:rPr>
-      </w:pPr>
-      <w:r>
-        <w:rPr>
-          <w:rFonts w:ascii="Sakkal Majalla" w:hAnsi="Sakkal Majalla" w:cs="Sakkal Majalla"/>
-          <w:b/>
-          <w:bCs/>
-          <w:color w:val="FFFFFF"/>
-          <w:sz w:val="26"/>
-          <w:szCs w:val="26"/>
-          <w:rtl/>
-        </w:rPr>
-        <w:t xml:space="preserve">خاتمة الكتاب: ما أنجزه وما لم ينجزه</w:t>
-      </w:r>
-    </w:p>
-    <w:p>
-      <w:pPr>
-        <w:bidi/>
-        <w:spacing w:after="90"/>
-        <w:rPr>
-          <w:rFonts w:ascii="Sakkal Majalla" w:hAnsi="Sakkal Majalla" w:cs="Sakkal Majalla"/>
-          <w:sz w:val="26"/>
-          <w:szCs w:val="26"/>
-        </w:rPr>
-      </w:pPr>
-      <w:r>
-        <w:rPr>
-          <w:rFonts w:ascii="Sakkal Majalla" w:hAnsi="Sakkal Majalla" w:cs="Sakkal Majalla"/>
-          <w:color w:val="000000"/>
-          <w:sz w:val="26"/>
-          <w:szCs w:val="26"/>
-          <w:rtl/>
-        </w:rPr>
-        <w:t xml:space="preserve">بدأ الكتاب بسؤال واحد: هل يمكن أن نشتق من القرآن الكريم منظومة إدارية تصمد نظريًا، وتُعلن حدودها، وتقبل الاختبار؟ وهذا ما حاول الكتاب أن يقدمه في أربعة عشر فصلًا، وما بقي عليه:</w:t>
-      </w:r>
-    </w:p>
-    <w:tbl>
-      <w:tblPr>
-        <w:tblW w:w="8640" w:type="dxa"/>
-        <w:tblBorders>
-          <w:top w:val="single" w:sz="4" w:space="0" w:color="auto"/>
-          <w:left w:val="single" w:sz="4" w:space="0" w:color="auto"/>
-          <w:bottom w:val="single" w:sz="4" w:space="0" w:color="auto"/>
-          <w:right w:val="single" w:sz="4" w:space="0" w:color="auto"/>
-          <w:insideH w:val="single" w:sz="4" w:space="0" w:color="auto"/>
-          <w:insideV w:val="single" w:sz="4" w:space="0" w:color="auto"/>
-        </w:tblBorders>
-        <w:tblLayout w:type="fixed"/>
-        <w:tblCellMar>
-          <w:left w:w="10" w:type="dxa"/>
-          <w:right w:w="10" w:type="dxa"/>
-        </w:tblCellMar>
-        <w:tblLook w:val="0000" w:firstRow="0" w:lastRow="0" w:firstColumn="0" w:lastColumn="0" w:noHBand="0" w:noVBand="0"/>
-      </w:tblPr>
-      <w:tblGrid>
-        <w:gridCol w:w="2160"/>
-        <w:gridCol w:w="6480"/>
-      </w:tblGrid>
-      <w:tr>
-        <w:tc>
-          <w:tcPr>
-            <w:tcW w:w="2160" w:type="dxa"/>
-            <w:shd w:val="clear" w:color="auto" w:fill="1F3864"/>
-            <w:tcMar>
-              <w:top w:w="66" w:type="dxa"/>
-              <w:left w:w="88" w:type="dxa"/>
-              <w:bottom w:w="66" w:type="dxa"/>
-              <w:right w:w="88" w:type="dxa"/>
-            </w:tcMar>
-            <w:vAlign w:val="center"/>
-          </w:tcPr>
-          <w:p>
-            <w:pPr>
-              <w:bidi/>
-              <w:spacing w:before="44" w:after="44"/>
-              <w:rPr>
-                <w:rFonts w:ascii="Sakkal Majalla" w:hAnsi="Sakkal Majalla" w:cs="Sakkal Majalla"/>
-                <w:sz w:val="26"/>
-                <w:szCs w:val="26"/>
-              </w:rPr>
-            </w:pPr>
-            <w:r>
-              <w:rPr>
-                <w:rFonts w:ascii="Sakkal Majalla" w:hAnsi="Sakkal Majalla" w:cs="Sakkal Majalla"/>
-                <w:b/>
-                <w:bCs/>
-                <w:color w:val="FFFFFF"/>
-                <w:sz w:val="26"/>
-                <w:szCs w:val="26"/>
-                <w:rtl/>
-              </w:rPr>
-              <w:t xml:space="preserve">البُعد</w:t>
-            </w:r>
-          </w:p>
-        </w:tc>
-        <w:tc>
-          <w:tcPr>
-            <w:tcW w:w="6480" w:type="dxa"/>
-            <w:shd w:val="clear" w:color="auto" w:fill="1F3864"/>
-            <w:tcMar>
-              <w:top w:w="66" w:type="dxa"/>
-              <w:left w:w="88" w:type="dxa"/>
-              <w:bottom w:w="66" w:type="dxa"/>
-              <w:right w:w="88" w:type="dxa"/>
-            </w:tcMar>
-            <w:vAlign w:val="center"/>
-          </w:tcPr>
-          <w:p>
-            <w:pPr>
-              <w:bidi/>
-              <w:spacing w:before="44" w:after="44"/>
-              <w:rPr>
-                <w:rFonts w:ascii="Sakkal Majalla" w:hAnsi="Sakkal Majalla" w:cs="Sakkal Majalla"/>
-                <w:sz w:val="26"/>
-                <w:szCs w:val="26"/>
-              </w:rPr>
-            </w:pPr>
-            <w:r>
-              <w:rPr>
-                <w:rFonts w:ascii="Sakkal Majalla" w:hAnsi="Sakkal Majalla" w:cs="Sakkal Majalla"/>
-                <w:b/>
-                <w:bCs/>
-                <w:color w:val="FFFFFF"/>
-                <w:sz w:val="26"/>
-                <w:szCs w:val="26"/>
-                <w:rtl/>
-              </w:rPr>
-              <w:t xml:space="preserve">ما قدّمه الكتاب</w:t>
-            </w:r>
-          </w:p>
-        </w:tc>
-      </w:tr>
-      <w:tr>
-        <w:tc>
-          <w:tcPr>
-            <w:tcW w:w="2160" w:type="dxa"/>
-            <w:shd w:val="clear" w:color="auto" w:fill="EBF5FB"/>
-            <w:tcMar>
-              <w:top w:w="66" w:type="dxa"/>
-              <w:left w:w="88" w:type="dxa"/>
-              <w:bottom w:w="66" w:type="dxa"/>
-              <w:right w:w="88" w:type="dxa"/>
-            </w:tcMar>
-            <w:vAlign w:val="center"/>
-          </w:tcPr>
-          <w:p>
-            <w:pPr>
-              <w:bidi/>
-              <w:spacing w:before="44" w:after="44"/>
-              <w:rPr>
-                <w:rFonts w:ascii="Sakkal Majalla" w:hAnsi="Sakkal Majalla" w:cs="Sakkal Majalla"/>
-                <w:sz w:val="26"/>
-                <w:szCs w:val="26"/>
-              </w:rPr>
-            </w:pPr>
-            <w:r>
-              <w:rPr>
-                <w:rFonts w:ascii="Sakkal Majalla" w:hAnsi="Sakkal Majalla" w:cs="Sakkal Majalla"/>
-                <w:b/>
-                <w:bCs/>
-                <w:color w:val="1F3864"/>
-                <w:sz w:val="26"/>
-                <w:szCs w:val="26"/>
-                <w:rtl/>
-              </w:rPr>
-              <w:t xml:space="preserve">المنهج</w:t>
-            </w:r>
-          </w:p>
-        </w:tc>
-        <w:tc>
-          <w:tcPr>
-            <w:tcW w:w="6480" w:type="dxa"/>
-            <w:shd w:val="clear" w:color="auto" w:fill="F5FAFF"/>
-            <w:tcMar>
-              <w:top w:w="66" w:type="dxa"/>
-              <w:left w:w="88" w:type="dxa"/>
-              <w:bottom w:w="66" w:type="dxa"/>
-              <w:right w:w="88" w:type="dxa"/>
-            </w:tcMar>
-            <w:vAlign w:val="center"/>
-          </w:tcPr>
-          <w:p>
-            <w:pPr>
-              <w:bidi/>
-              <w:spacing w:before="44" w:after="44"/>
-              <w:rPr>
-                <w:rFonts w:ascii="Sakkal Majalla" w:hAnsi="Sakkal Majalla" w:cs="Sakkal Majalla"/>
-                <w:sz w:val="26"/>
-                <w:szCs w:val="26"/>
-              </w:rPr>
-            </w:pPr>
-            <w:r>
-              <w:rPr>
-                <w:rFonts w:ascii="Sakkal Majalla" w:hAnsi="Sakkal Majalla" w:cs="Sakkal Majalla"/>
-                <w:color w:val="000000"/>
-                <w:sz w:val="26"/>
-                <w:szCs w:val="26"/>
-                <w:rtl/>
-              </w:rPr>
-              <w:t xml:space="preserve">محكّات الفرضية الصفرية (الفصل الثالث)، وهرم مصادر الاستدلال (الفصل الرابع)، وسلم الاشتقاق السباعي وبطاقة الهوية المعرفية (الفصل الخامس)، وبروتوكول القراءة الثماني (الفصل السادس)، وقاعدة فض التعارض بين النص والتجربة (الفصل السابع).</w:t>
-            </w:r>
-          </w:p>
-        </w:tc>
-      </w:tr>
-      <w:tr>
-        <w:tc>
-          <w:tcPr>
-            <w:tcW w:w="2160" w:type="dxa"/>
-            <w:shd w:val="clear" w:color="auto" w:fill="FFFFFF"/>
-            <w:tcMar>
-              <w:top w:w="66" w:type="dxa"/>
-              <w:left w:w="88" w:type="dxa"/>
-              <w:bottom w:w="66" w:type="dxa"/>
-              <w:right w:w="88" w:type="dxa"/>
-            </w:tcMar>
-            <w:vAlign w:val="center"/>
-          </w:tcPr>
-          <w:p>
-            <w:pPr>
-              <w:bidi/>
-              <w:spacing w:before="44" w:after="44"/>
-              <w:rPr>
-                <w:rFonts w:ascii="Sakkal Majalla" w:hAnsi="Sakkal Majalla" w:cs="Sakkal Majalla"/>
-                <w:sz w:val="26"/>
-                <w:szCs w:val="26"/>
-              </w:rPr>
-            </w:pPr>
-            <w:r>
-              <w:rPr>
-                <w:rFonts w:ascii="Sakkal Majalla" w:hAnsi="Sakkal Majalla" w:cs="Sakkal Majalla"/>
-                <w:b/>
-                <w:bCs/>
-                <w:color w:val="1F3864"/>
-                <w:sz w:val="26"/>
-                <w:szCs w:val="26"/>
-                <w:rtl/>
-              </w:rPr>
-              <w:t xml:space="preserve">الإنسان</w:t>
-            </w:r>
-          </w:p>
-        </w:tc>
-        <w:tc>
-          <w:tcPr>
-            <w:tcW w:w="6480" w:type="dxa"/>
-            <w:shd w:val="clear" w:color="auto" w:fill="FFFFFF"/>
-            <w:tcMar>
-              <w:top w:w="66" w:type="dxa"/>
-              <w:left w:w="88" w:type="dxa"/>
-              <w:bottom w:w="66" w:type="dxa"/>
-              <w:right w:w="88" w:type="dxa"/>
-            </w:tcMar>
-            <w:vAlign w:val="center"/>
-          </w:tcPr>
-          <w:p>
-            <w:pPr>
-              <w:bidi/>
-              <w:spacing w:before="44" w:after="44"/>
-              <w:rPr>
-                <w:rFonts w:ascii="Sakkal Majalla" w:hAnsi="Sakkal Majalla" w:cs="Sakkal Majalla"/>
-                <w:sz w:val="26"/>
-                <w:szCs w:val="26"/>
-              </w:rPr>
-            </w:pPr>
-            <w:r>
-              <w:rPr>
-                <w:rFonts w:ascii="Sakkal Majalla" w:hAnsi="Sakkal Majalla" w:cs="Sakkal Majalla"/>
-                <w:color w:val="000000"/>
-                <w:sz w:val="26"/>
-                <w:szCs w:val="26"/>
-                <w:rtl/>
-              </w:rPr>
-              <w:t xml:space="preserve">مستخلَف، ومكلَّف بالوسع، ومبتلى (الفصل الثامن): من الذي يُدار؟</w:t>
-            </w:r>
-          </w:p>
-        </w:tc>
-      </w:tr>
-      <w:tr>
-        <w:tc>
-          <w:tcPr>
-            <w:tcW w:w="2160" w:type="dxa"/>
-            <w:shd w:val="clear" w:color="auto" w:fill="EBF5FB"/>
-            <w:tcMar>
-              <w:top w:w="66" w:type="dxa"/>
-              <w:left w:w="88" w:type="dxa"/>
-              <w:bottom w:w="66" w:type="dxa"/>
-              <w:right w:w="88" w:type="dxa"/>
-            </w:tcMar>
-            <w:vAlign w:val="center"/>
-          </w:tcPr>
-          <w:p>
-            <w:pPr>
-              <w:bidi/>
-              <w:spacing w:before="44" w:after="44"/>
-              <w:rPr>
-                <w:rFonts w:ascii="Sakkal Majalla" w:hAnsi="Sakkal Majalla" w:cs="Sakkal Majalla"/>
-                <w:sz w:val="26"/>
-                <w:szCs w:val="26"/>
-              </w:rPr>
-            </w:pPr>
-            <w:r>
-              <w:rPr>
-                <w:rFonts w:ascii="Sakkal Majalla" w:hAnsi="Sakkal Majalla" w:cs="Sakkal Majalla"/>
-                <w:b/>
-                <w:bCs/>
-                <w:color w:val="1F3864"/>
-                <w:sz w:val="26"/>
-                <w:szCs w:val="26"/>
-                <w:rtl/>
-              </w:rPr>
-              <w:t xml:space="preserve">المعرفة</w:t>
-            </w:r>
-          </w:p>
-        </w:tc>
-        <w:tc>
-          <w:tcPr>
-            <w:tcW w:w="6480" w:type="dxa"/>
-            <w:shd w:val="clear" w:color="auto" w:fill="F5FAFF"/>
-            <w:tcMar>
-              <w:top w:w="66" w:type="dxa"/>
-              <w:left w:w="88" w:type="dxa"/>
-              <w:bottom w:w="66" w:type="dxa"/>
-              <w:right w:w="88" w:type="dxa"/>
-            </w:tcMar>
-            <w:vAlign w:val="center"/>
-          </w:tcPr>
-          <w:p>
-            <w:pPr>
-              <w:bidi/>
-              <w:spacing w:before="44" w:after="44"/>
-              <w:rPr>
-                <w:rFonts w:ascii="Sakkal Majalla" w:hAnsi="Sakkal Majalla" w:cs="Sakkal Majalla"/>
-                <w:sz w:val="26"/>
-                <w:szCs w:val="26"/>
-              </w:rPr>
-            </w:pPr>
-            <w:r>
-              <w:rPr>
-                <w:rFonts w:ascii="Sakkal Majalla" w:hAnsi="Sakkal Majalla" w:cs="Sakkal Majalla"/>
-                <w:color w:val="000000"/>
-                <w:sz w:val="26"/>
-                <w:szCs w:val="26"/>
-                <w:rtl/>
-              </w:rPr>
-              <w:t xml:space="preserve">فطرة، وتثبت، وتدبر (الفصل التاسع): كيف يعرف المدير؟</w:t>
-            </w:r>
-          </w:p>
-        </w:tc>
-      </w:tr>
-      <w:tr>
-        <w:tc>
-          <w:tcPr>
-            <w:tcW w:w="2160" w:type="dxa"/>
-            <w:shd w:val="clear" w:color="auto" w:fill="FFFFFF"/>
-            <w:tcMar>
-              <w:top w:w="66" w:type="dxa"/>
-              <w:left w:w="88" w:type="dxa"/>
-              <w:bottom w:w="66" w:type="dxa"/>
-              <w:right w:w="88" w:type="dxa"/>
-            </w:tcMar>
-            <w:vAlign w:val="center"/>
-          </w:tcPr>
-          <w:p>
-            <w:pPr>
-              <w:bidi/>
-              <w:spacing w:before="44" w:after="44"/>
-              <w:rPr>
-                <w:rFonts w:ascii="Sakkal Majalla" w:hAnsi="Sakkal Majalla" w:cs="Sakkal Majalla"/>
-                <w:sz w:val="26"/>
-                <w:szCs w:val="26"/>
-              </w:rPr>
-            </w:pPr>
-            <w:r>
-              <w:rPr>
-                <w:rFonts w:ascii="Sakkal Majalla" w:hAnsi="Sakkal Majalla" w:cs="Sakkal Majalla"/>
-                <w:b/>
-                <w:bCs/>
-                <w:color w:val="1F3864"/>
-                <w:sz w:val="26"/>
-                <w:szCs w:val="26"/>
-                <w:rtl/>
-              </w:rPr>
-              <w:t xml:space="preserve">القيم</w:t>
-            </w:r>
-          </w:p>
-        </w:tc>
-        <w:tc>
-          <w:tcPr>
-            <w:tcW w:w="6480" w:type="dxa"/>
-            <w:shd w:val="clear" w:color="auto" w:fill="FFFFFF"/>
-            <w:tcMar>
-              <w:top w:w="66" w:type="dxa"/>
-              <w:left w:w="88" w:type="dxa"/>
-              <w:bottom w:w="66" w:type="dxa"/>
-              <w:right w:w="88" w:type="dxa"/>
-            </w:tcMar>
-            <w:vAlign w:val="center"/>
-          </w:tcPr>
-          <w:p>
-            <w:pPr>
-              <w:bidi/>
-              <w:spacing w:before="44" w:after="44"/>
-              <w:rPr>
-                <w:rFonts w:ascii="Sakkal Majalla" w:hAnsi="Sakkal Majalla" w:cs="Sakkal Majalla"/>
-                <w:sz w:val="26"/>
-                <w:szCs w:val="26"/>
-              </w:rPr>
-            </w:pPr>
-            <w:r>
-              <w:rPr>
-                <w:rFonts w:ascii="Sakkal Majalla" w:hAnsi="Sakkal Majalla" w:cs="Sakkal Majalla"/>
-                <w:color w:val="000000"/>
-                <w:sz w:val="26"/>
-                <w:szCs w:val="26"/>
-                <w:rtl/>
-              </w:rPr>
-              <w:t xml:space="preserve">منظومة سباعية: الأمانة والشورى والإحسان والعدل، ثم الرحمة والحكمة والصدق (الفصول 3–6، والعاشر): بأي ميزان يتصرف؟</w:t>
-            </w:r>
-          </w:p>
-        </w:tc>
-      </w:tr>
-      <w:tr>
-        <w:tc>
-          <w:tcPr>
-            <w:tcW w:w="2160" w:type="dxa"/>
-            <w:shd w:val="clear" w:color="auto" w:fill="EBF5FB"/>
-            <w:tcMar>
-              <w:top w:w="66" w:type="dxa"/>
-              <w:left w:w="88" w:type="dxa"/>
-              <w:bottom w:w="66" w:type="dxa"/>
-              <w:right w:w="88" w:type="dxa"/>
-            </w:tcMar>
-            <w:vAlign w:val="center"/>
-          </w:tcPr>
-          <w:p>
-            <w:pPr>
-              <w:bidi/>
-              <w:spacing w:before="44" w:after="44"/>
-              <w:rPr>
-                <w:rFonts w:ascii="Sakkal Majalla" w:hAnsi="Sakkal Majalla" w:cs="Sakkal Majalla"/>
-                <w:sz w:val="26"/>
-                <w:szCs w:val="26"/>
-              </w:rPr>
-            </w:pPr>
-            <w:r>
-              <w:rPr>
-                <w:rFonts w:ascii="Sakkal Majalla" w:hAnsi="Sakkal Majalla" w:cs="Sakkal Majalla"/>
-                <w:b/>
-                <w:bCs/>
-                <w:color w:val="1F3864"/>
-                <w:sz w:val="26"/>
-                <w:szCs w:val="26"/>
-                <w:rtl/>
-              </w:rPr>
-              <w:t xml:space="preserve">البنية</w:t>
-            </w:r>
-          </w:p>
-        </w:tc>
-        <w:tc>
-          <w:tcPr>
-            <w:tcW w:w="6480" w:type="dxa"/>
-            <w:shd w:val="clear" w:color="auto" w:fill="F5FAFF"/>
-            <w:tcMar>
-              <w:top w:w="66" w:type="dxa"/>
-              <w:left w:w="88" w:type="dxa"/>
-              <w:bottom w:w="66" w:type="dxa"/>
-              <w:right w:w="88" w:type="dxa"/>
-            </w:tcMar>
-            <w:vAlign w:val="center"/>
-          </w:tcPr>
-          <w:p>
-            <w:pPr>
-              <w:bidi/>
-              <w:spacing w:before="44" w:after="44"/>
-              <w:rPr>
-                <w:rFonts w:ascii="Sakkal Majalla" w:hAnsi="Sakkal Majalla" w:cs="Sakkal Majalla"/>
-                <w:sz w:val="26"/>
-                <w:szCs w:val="26"/>
-              </w:rPr>
-            </w:pPr>
-            <w:r>
-              <w:rPr>
-                <w:rFonts w:ascii="Sakkal Majalla" w:hAnsi="Sakkal Majalla" w:cs="Sakkal Majalla"/>
-                <w:color w:val="000000"/>
-                <w:sz w:val="26"/>
-                <w:szCs w:val="26"/>
-                <w:rtl/>
-              </w:rPr>
-              <w:t xml:space="preserve">إطار QMF بمكوّناته الثمانية، ومعه السلطة داخل المساءلة (الفصل الحادي عشر).</w:t>
-            </w:r>
-          </w:p>
-        </w:tc>
-      </w:tr>
-      <w:tr>
-        <w:tc>
-          <w:tcPr>
-            <w:tcW w:w="2160" w:type="dxa"/>
-            <w:shd w:val="clear" w:color="auto" w:fill="FFFFFF"/>
-            <w:tcMar>
-              <w:top w:w="66" w:type="dxa"/>
-              <w:left w:w="88" w:type="dxa"/>
-              <w:bottom w:w="66" w:type="dxa"/>
-              <w:right w:w="88" w:type="dxa"/>
-            </w:tcMar>
-            <w:vAlign w:val="center"/>
-          </w:tcPr>
-          <w:p>
-            <w:pPr>
-              <w:bidi/>
-              <w:spacing w:before="44" w:after="44"/>
-              <w:rPr>
-                <w:rFonts w:ascii="Sakkal Majalla" w:hAnsi="Sakkal Majalla" w:cs="Sakkal Majalla"/>
-                <w:sz w:val="26"/>
-                <w:szCs w:val="26"/>
-              </w:rPr>
-            </w:pPr>
-            <w:r>
-              <w:rPr>
-                <w:rFonts w:ascii="Sakkal Majalla" w:hAnsi="Sakkal Majalla" w:cs="Sakkal Majalla"/>
-                <w:b/>
-                <w:bCs/>
-                <w:color w:val="1F3864"/>
-                <w:sz w:val="26"/>
-                <w:szCs w:val="26"/>
-                <w:rtl/>
-              </w:rPr>
-              <w:t xml:space="preserve">الحركة</w:t>
-            </w:r>
-          </w:p>
-        </w:tc>
-        <w:tc>
-          <w:tcPr>
-            <w:tcW w:w="6480" w:type="dxa"/>
-            <w:shd w:val="clear" w:color="auto" w:fill="FFFFFF"/>
-            <w:tcMar>
-              <w:top w:w="66" w:type="dxa"/>
-              <w:left w:w="88" w:type="dxa"/>
-              <w:bottom w:w="66" w:type="dxa"/>
-              <w:right w:w="88" w:type="dxa"/>
-            </w:tcMar>
-            <w:vAlign w:val="center"/>
-          </w:tcPr>
-          <w:p>
-            <w:pPr>
-              <w:bidi/>
-              <w:spacing w:before="44" w:after="44"/>
-              <w:rPr>
-                <w:rFonts w:ascii="Sakkal Majalla" w:hAnsi="Sakkal Majalla" w:cs="Sakkal Majalla"/>
-                <w:sz w:val="26"/>
-                <w:szCs w:val="26"/>
-              </w:rPr>
-            </w:pPr>
-            <w:r>
-              <w:rPr>
-                <w:rFonts w:ascii="Sakkal Majalla" w:hAnsi="Sakkal Majalla" w:cs="Sakkal Majalla"/>
-                <w:color w:val="000000"/>
-                <w:sz w:val="26"/>
-                <w:szCs w:val="26"/>
-                <w:rtl/>
-              </w:rPr>
-              <w:t xml:space="preserve">الدورة السباعية من الاستشعار إلى المتابعة، مع سجل القرار وقاعدة الاختصار (الفصل الثاني عشر).</w:t>
-            </w:r>
-          </w:p>
-        </w:tc>
-      </w:tr>
-      <w:tr>
-        <w:tc>
-          <w:tcPr>
-            <w:tcW w:w="2160" w:type="dxa"/>
-            <w:shd w:val="clear" w:color="auto" w:fill="EBF5FB"/>
-            <w:tcMar>
-              <w:top w:w="66" w:type="dxa"/>
-              <w:left w:w="88" w:type="dxa"/>
-              <w:bottom w:w="66" w:type="dxa"/>
-              <w:right w:w="88" w:type="dxa"/>
-            </w:tcMar>
-            <w:vAlign w:val="center"/>
-          </w:tcPr>
-          <w:p>
-            <w:pPr>
-              <w:bidi/>
-              <w:spacing w:before="44" w:after="44"/>
-              <w:rPr>
-                <w:rFonts w:ascii="Sakkal Majalla" w:hAnsi="Sakkal Majalla" w:cs="Sakkal Majalla"/>
-                <w:sz w:val="26"/>
-                <w:szCs w:val="26"/>
-              </w:rPr>
-            </w:pPr>
-            <w:r>
-              <w:rPr>
-                <w:rFonts w:ascii="Sakkal Majalla" w:hAnsi="Sakkal Majalla" w:cs="Sakkal Majalla"/>
-                <w:b/>
-                <w:bCs/>
-                <w:color w:val="1F3864"/>
-                <w:sz w:val="26"/>
-                <w:szCs w:val="26"/>
-                <w:rtl/>
-              </w:rPr>
-              <w:t xml:space="preserve">الضبط</w:t>
-            </w:r>
-          </w:p>
-        </w:tc>
-        <w:tc>
-          <w:tcPr>
-            <w:tcW w:w="6480" w:type="dxa"/>
-            <w:shd w:val="clear" w:color="auto" w:fill="F5FAFF"/>
-            <w:tcMar>
-              <w:top w:w="66" w:type="dxa"/>
-              <w:left w:w="88" w:type="dxa"/>
-              <w:bottom w:w="66" w:type="dxa"/>
-              <w:right w:w="88" w:type="dxa"/>
-            </w:tcMar>
-            <w:vAlign w:val="center"/>
-          </w:tcPr>
-          <w:p>
-            <w:pPr>
-              <w:bidi/>
-              <w:spacing w:before="44" w:after="44"/>
-              <w:rPr>
-                <w:rFonts w:ascii="Sakkal Majalla" w:hAnsi="Sakkal Majalla" w:cs="Sakkal Majalla"/>
-                <w:sz w:val="26"/>
-                <w:szCs w:val="26"/>
-              </w:rPr>
-            </w:pPr>
-            <w:r>
-              <w:rPr>
-                <w:rFonts w:ascii="Sakkal Majalla" w:hAnsi="Sakkal Majalla" w:cs="Sakkal Majalla"/>
-                <w:color w:val="000000"/>
-                <w:sz w:val="26"/>
-                <w:szCs w:val="26"/>
-                <w:rtl/>
-              </w:rPr>
-              <w:t xml:space="preserve">تسعة معايير للحكم على قرآنية أي نموذج، وقاعدة: فشل التطبيق يُراجَع فيه النموذج البشري لا النص (الفصل الثالث عشر).</w:t>
-            </w:r>
-          </w:p>
-        </w:tc>
-      </w:tr>
-      <w:tr>
-        <w:tc>
-          <w:tcPr>
-            <w:tcW w:w="2160" w:type="dxa"/>
-            <w:shd w:val="clear" w:color="auto" w:fill="FFFFFF"/>
-            <w:tcMar>
-              <w:top w:w="66" w:type="dxa"/>
-              <w:left w:w="88" w:type="dxa"/>
-              <w:bottom w:w="66" w:type="dxa"/>
-              <w:right w:w="88" w:type="dxa"/>
-            </w:tcMar>
-            <w:vAlign w:val="center"/>
-          </w:tcPr>
-          <w:p>
-            <w:pPr>
-              <w:bidi/>
-              <w:spacing w:before="44" w:after="44"/>
-              <w:rPr>
-                <w:rFonts w:ascii="Sakkal Majalla" w:hAnsi="Sakkal Majalla" w:cs="Sakkal Majalla"/>
-                <w:sz w:val="26"/>
-                <w:szCs w:val="26"/>
-              </w:rPr>
-            </w:pPr>
-            <w:r>
-              <w:rPr>
-                <w:rFonts w:ascii="Sakkal Majalla" w:hAnsi="Sakkal Majalla" w:cs="Sakkal Majalla"/>
-                <w:b/>
-                <w:bCs/>
-                <w:color w:val="1F3864"/>
-                <w:sz w:val="26"/>
-                <w:szCs w:val="26"/>
-                <w:rtl/>
-              </w:rPr>
-              <w:t xml:space="preserve">التطبيق</w:t>
-            </w:r>
-          </w:p>
-        </w:tc>
-        <w:tc>
-          <w:tcPr>
-            <w:tcW w:w="6480" w:type="dxa"/>
-            <w:shd w:val="clear" w:color="auto" w:fill="FFFFFF"/>
-            <w:tcMar>
-              <w:top w:w="66" w:type="dxa"/>
-              <w:left w:w="88" w:type="dxa"/>
-              <w:bottom w:w="66" w:type="dxa"/>
-              <w:right w:w="88" w:type="dxa"/>
-            </w:tcMar>
-            <w:vAlign w:val="center"/>
-          </w:tcPr>
-          <w:p>
-            <w:pPr>
-              <w:bidi/>
-              <w:spacing w:before="44" w:after="44"/>
-              <w:rPr>
-                <w:rFonts w:ascii="Sakkal Majalla" w:hAnsi="Sakkal Majalla" w:cs="Sakkal Majalla"/>
-                <w:sz w:val="26"/>
-                <w:szCs w:val="26"/>
-              </w:rPr>
-            </w:pPr>
-            <w:r>
-              <w:rPr>
-                <w:rFonts w:ascii="Sakkal Majalla" w:hAnsi="Sakkal Majalla" w:cs="Sakkal Majalla"/>
-                <w:color w:val="000000"/>
-                <w:sz w:val="26"/>
-                <w:szCs w:val="26"/>
-                <w:rtl/>
-              </w:rPr>
-              <w:t xml:space="preserve">ثماني حالات مركبة توضح عمل الجهاز في ميادين مختلفة (هذا الفصل).</w:t>
-            </w:r>
-          </w:p>
-        </w:tc>
-      </w:tr>
-      <w:tr>
-        <w:tc>
-          <w:tcPr>
-            <w:tcW w:w="2160" w:type="dxa"/>
-            <w:shd w:val="clear" w:color="auto" w:fill="FFF0F0"/>
-            <w:tcMar>
-              <w:top w:w="66" w:type="dxa"/>
-              <w:left w:w="88" w:type="dxa"/>
-              <w:bottom w:w="66" w:type="dxa"/>
-              <w:right w:w="88" w:type="dxa"/>
-            </w:tcMar>
-            <w:vAlign w:val="center"/>
-          </w:tcPr>
-          <w:p>
-            <w:pPr>
-              <w:bidi/>
-              <w:spacing w:before="44" w:after="44"/>
-              <w:rPr>
-                <w:rFonts w:ascii="Sakkal Majalla" w:hAnsi="Sakkal Majalla" w:cs="Sakkal Majalla"/>
-                <w:sz w:val="26"/>
-                <w:szCs w:val="26"/>
-              </w:rPr>
-            </w:pPr>
-            <w:r>
-              <w:rPr>
-                <w:rFonts w:ascii="Sakkal Majalla" w:hAnsi="Sakkal Majalla" w:cs="Sakkal Majalla"/>
-                <w:b/>
-                <w:bCs/>
-                <w:color w:val="C00000"/>
-                <w:sz w:val="26"/>
-                <w:szCs w:val="26"/>
-                <w:rtl/>
-              </w:rPr>
-              <w:t xml:space="preserve">ما لم يُنجز</w:t>
-            </w:r>
-          </w:p>
-        </w:tc>
-        <w:tc>
-          <w:tcPr>
-            <w:tcW w:w="6480" w:type="dxa"/>
-            <w:shd w:val="clear" w:color="auto" w:fill="FFF0F0"/>
-            <w:tcMar>
-              <w:top w:w="66" w:type="dxa"/>
-              <w:left w:w="88" w:type="dxa"/>
-              <w:bottom w:w="66" w:type="dxa"/>
-              <w:right w:w="88" w:type="dxa"/>
-            </w:tcMar>
-            <w:vAlign w:val="center"/>
-          </w:tcPr>
-          <w:p>
-            <w:pPr>
-              <w:bidi/>
-              <w:spacing w:before="44" w:after="44"/>
-              <w:rPr>
-                <w:rFonts w:ascii="Sakkal Majalla" w:hAnsi="Sakkal Majalla" w:cs="Sakkal Majalla"/>
-                <w:sz w:val="26"/>
-                <w:szCs w:val="26"/>
-              </w:rPr>
-            </w:pPr>
-            <w:r>
-              <w:rPr>
-                <w:rFonts w:ascii="Sakkal Majalla" w:hAnsi="Sakkal Majalla" w:cs="Sakkal Majalla"/>
-                <w:color w:val="000000"/>
-                <w:sz w:val="26"/>
-                <w:szCs w:val="26"/>
-                <w:rtl/>
-              </w:rPr>
-              <w:t xml:space="preserve">الاختبار الميداني (المستوى السابع) لم يُنفَّذ لأي ركن، واختبار الباحث المقيَّد لم يُجرَ، ومقاييس القيم لم تُبنَ. وهذه أولى مسؤوليات الكتب اللاحقة.</w:t>
-            </w:r>
-          </w:p>
-        </w:tc>
-      </w:tr>
-    </w:tbl>
-    <w:p>
-      <w:pPr>
-        <w:bidi/>
-        <w:spacing w:after="90"/>
-        <w:rPr>
-          <w:rFonts w:ascii="Sakkal Majalla" w:hAnsi="Sakkal Majalla" w:cs="Sakkal Majalla"/>
-          <w:sz w:val="26"/>
-          <w:szCs w:val="26"/>
-        </w:rPr>
-      </w:pPr>
-      <w:r>
-        <w:rPr>
-          <w:rFonts w:ascii="Sakkal Majalla" w:hAnsi="Sakkal Majalla" w:cs="Sakkal Majalla"/>
-          <w:color w:val="000000"/>
-          <w:sz w:val="26"/>
-          <w:szCs w:val="26"/>
-          <w:rtl/>
-        </w:rPr>
-        <w:t xml:space="preserve">ولا أعدّ هذا الكتاب جوابًا نهائيًا. إنه اجتهاد يعلن هوامشه، ويضع لنفسه معايير يمكن أن يُحاكَم إليها، ويقبل أن يُراجَع إذا خالفته التجربة. فإن أصاب فبتوفيق الله، وإن أخطأ فمن تقصير صاحبه. والكتاب الثاني من الموسوعة ينتقل إلى التطبيقات المؤسسية التفصيلية، في القيادة وصنع القرار وإدارة الموارد البشرية والمحاسبة المؤسسية، ويبني على ما أُرسي هنا، ويختبره بحالات حقيقية موثقة.</w:t>
-      </w:r>
-    </w:p>
-    <w:p>
-      <w:pPr>
-        <w:bidi/>
-        <w:spacing w:after="55"/>
-        <w:jc w:val="center"/>
-        <w:rPr>
-          <w:rFonts w:ascii="Sakkal Majalla" w:hAnsi="Sakkal Majalla" w:cs="Sakkal Majalla"/>
-          <w:sz w:val="28"/>
-          <w:szCs w:val="28"/>
-        </w:rPr>
-      </w:pPr>
-    </w:p>
-    <w:p>
-      <w:pPr>
-        <w:shd w:val="clear" w:color="auto" w:fill="F5F0FF"/>
-        <w:bidi/>
-        <w:spacing w:before="10"/>
-        <w:rPr>
-          <w:rFonts w:ascii="Sakkal Majalla" w:hAnsi="Sakkal Majalla" w:cs="Sakkal Majalla"/>
-          <w:sz w:val="26"/>
-          <w:szCs w:val="26"/>
-        </w:rPr>
-      </w:pPr>
-      <w:r>
-        <w:rPr>
-          <w:rFonts w:ascii="Sakkal Majalla" w:hAnsi="Sakkal Majalla" w:cs="Sakkal Majalla"/>
-          <w:b/>
-          <w:bCs/>
-          <w:color w:val="1F3864"/>
-          <w:sz w:val="26"/>
-          <w:szCs w:val="26"/>
-          <w:rtl/>
-        </w:rPr>
-        <w:t>﴿رَبَّنَا آتِنَا مِن لَّدُنكَ رَحْمَةً وَهَيِّئْ لَنَا مِنْ أَمْرِنَا رَشَدًا﴾</w:t>
-      </w:r>
-    </w:p>
-    <w:p>
-      <w:pPr>
-        <w:bidi/>
-        <w:spacing w:after="18"/>
-        <w:rPr>
-          <w:rFonts w:ascii="Sakkal Majalla" w:hAnsi="Sakkal Majalla" w:cs="Sakkal Majalla"/>
-          <w:sz w:val="26"/>
-          <w:szCs w:val="26"/>
-        </w:rPr>
-      </w:pPr>
-      <w:r>
-        <w:rPr>
-          <w:rFonts w:ascii="Sakkal Majalla" w:hAnsi="Sakkal Majalla" w:cs="Sakkal Majalla"/>
-          <w:color w:val="595959"/>
-          <w:sz w:val="26"/>
-          <w:szCs w:val="26"/>
-          <w:rtl/>
-        </w:rPr>
-        <w:t>الكهف : 10</w:t>
-      </w:r>
-    </w:p>
-    <w:p>
-      <w:pPr>
-        <w:bidi/>
-        <w:spacing w:after="55"/>
-        <w:jc w:val="center"/>
-        <w:rPr>
-          <w:rFonts w:ascii="Sakkal Majalla" w:hAnsi="Sakkal Majalla" w:cs="Sakkal Majalla"/>
-          <w:sz w:val="28"/>
-          <w:szCs w:val="28"/>
-        </w:rPr>
-      </w:pPr>
-    </w:p>
-    <w:p>
-      <w:pPr>
-        <w:bidi/>
-        <w:spacing w:after="90"/>
-        <w:rPr>
-          <w:rFonts w:ascii="Sakkal Majalla" w:hAnsi="Sakkal Majalla" w:cs="Sakkal Majalla"/>
-          <w:sz w:val="26"/>
-          <w:szCs w:val="26"/>
-        </w:rPr>
-      </w:pPr>
-      <w:r>
-        <w:rPr>
-          <w:rFonts w:ascii="Sakkal Majalla" w:hAnsi="Sakkal Majalla" w:cs="Sakkal Majalla"/>
-          <w:color w:val="000000"/>
-          <w:sz w:val="26"/>
-          <w:szCs w:val="26"/>
-          <w:rtl/>
-        </w:rPr>
-        <w:t xml:space="preserve">وآخر دعوانا أن الحمد لله رب العالمين.</w:t>
-      </w:r>
-    </w:p>
     <w:p>
       <w:pPr>
         <w:bidi/>

</xml_diff>